<commit_message>
atualiza relatorio e diagrama com a regra do ator designado
Co-authored-by: Cursor <cursoragent@cursor.com>
</commit_message>
<xml_diff>
--- a/docs/relatorio/relatorio-tecnico-ecoorigem.docx
+++ b/docs/relatorio/relatorio-tecnico-ecoorigem.docx
@@ -1303,7 +1303,7 @@
           <w:rFonts w:ascii="Arial" w:hAnsi="Arial" w:eastAsia="Arial" w:cs="Arial"/>
           <w:i w:val="0"/>
         </w:rPr>
-        <w:t>A bioeconomia amazônica movimenta produtos como açaí, castanha-do-brasil, murumuru, cupuaçu, andiroba, óleos vegetais e artesanato. Entre a comunidade extrativista e o consumidor final, cada lote passa por beneficiamento, transporte e distribuição, e cada etapa fica sob responsabilidade de uma organização diferente. As informações sobre essa trajetória costumam ficar dispersas em planilhas, notas e sistemas isolados, sem garantia de que não foram alteradas depois.</w:t>
+        <w:t>A bioeconomia amazônica movimenta produtos como açaí, castanha-do-brasil, murumuru, cupuaçu, andiroba e óleos vegetais. Entre a comunidade extrativista e o consumidor final, cada lote passa por beneficiamento, transporte e distribuição, e cada etapa fica sob responsabilidade de uma organização diferente. As informações sobre essa trajetória costumam ficar dispersas em planilhas, notas e sistemas isolados, sem garantia de que não foram alteradas depois.</w:t>
       </w:r>
     </w:p>
     <w:p>
@@ -4506,7 +4506,7 @@
                 <w:b w:val="0"/>
                 <w:sz w:val="18"/>
               </w:rPr>
-              <w:t>Nenhuma</w:t>
+              <w:t>Designa o beneficiador do lote</w:t>
             </w:r>
           </w:p>
         </w:tc>
@@ -4610,7 +4610,7 @@
                 <w:b w:val="0"/>
                 <w:sz w:val="18"/>
               </w:rPr>
-              <w:t>Nenhuma</w:t>
+              <w:t>Só o beneficiador designado; designa o transportador</w:t>
             </w:r>
           </w:p>
         </w:tc>
@@ -4717,7 +4717,7 @@
                 <w:b w:val="0"/>
                 <w:sz w:val="18"/>
               </w:rPr>
-              <w:t>Deve designar um distribuidor com perfil válido</w:t>
+              <w:t>Só o transportador designado; designa um distribuidor com perfil válido</w:t>
             </w:r>
           </w:p>
         </w:tc>
@@ -4943,7 +4943,7 @@
           <w:color w:val="5A6B61"/>
           <w:sz w:val="18"/>
         </w:rPr>
-        <w:t>Legenda: o responsável atual pelo lote muda a cada etapa e é o único que pode anexar documentos.</w:t>
+        <w:t>Legenda: cada etapa designa quem executa a próxima; o responsável atual pelo lote muda a cada etapa e é o único que pode anexar documentos.</w:t>
       </w:r>
     </w:p>
     <w:p>
@@ -5538,7 +5538,7 @@
                 <w:b w:val="0"/>
                 <w:sz w:val="17"/>
               </w:rPr>
-              <w:t>Beneficiador</w:t>
+              <w:t>Beneficiador designado</w:t>
             </w:r>
           </w:p>
         </w:tc>
@@ -5604,7 +5604,7 @@
                 <w:b w:val="0"/>
                 <w:sz w:val="17"/>
               </w:rPr>
-              <w:t>INVALID_TRANSITION, LOT_NOT_FOUND</w:t>
+              <w:t>Outro beneficiador tenta registrar, INVALID_TRANSITION</w:t>
             </w:r>
           </w:p>
         </w:tc>
@@ -5677,7 +5677,7 @@
                 <w:b w:val="0"/>
                 <w:sz w:val="17"/>
               </w:rPr>
-              <w:t>Transportador</w:t>
+              <w:t>Transportador designado</w:t>
             </w:r>
           </w:p>
         </w:tc>
@@ -5745,7 +5745,7 @@
                 <w:b w:val="0"/>
                 <w:sz w:val="17"/>
               </w:rPr>
-              <w:t>Destinatário sem perfil de distribuidor</w:t>
+              <w:t>Outro transportador tenta iniciar, destinatário sem perfil de distribuidor</w:t>
             </w:r>
           </w:p>
         </w:tc>
@@ -7626,7 +7626,7 @@
           <w:rFonts w:ascii="Arial" w:hAnsi="Arial" w:eastAsia="Arial" w:cs="Arial"/>
           <w:i w:val="0"/>
         </w:rPr>
-        <w:t>Os testes automatizados usam pytest e cobrem, em camadas, a criptografia, a cadeia, o contrato, o nó, a API HTTP, o gateway, o cliente e a linha de comando. Foram executados 248 testes, todos aprovados, com cobertura de 97% das linhas e ramos do pacote. A Tabela 8 resume o resultado das verificações de qualidade.</w:t>
+        <w:t>Os testes automatizados usam pytest e cobrem, em camadas, a criptografia, a cadeia, o contrato, o nó, a API HTTP, o gateway, o cliente e a linha de comando. Foram executados 251 testes, todos aprovados, com cobertura de 97% das linhas e ramos do pacote. A Tabela 8 resume o resultado das verificações de qualidade.</w:t>
       </w:r>
     </w:p>
     <w:p>
@@ -7867,7 +7867,7 @@
                 <w:b w:val="0"/>
                 <w:sz w:val="18"/>
               </w:rPr>
-              <w:t>248 aprovados</w:t>
+              <w:t>251 aprovados</w:t>
             </w:r>
           </w:p>
         </w:tc>
@@ -8078,7 +8078,7 @@
                 <w:b w:val="0"/>
                 <w:sz w:val="18"/>
               </w:rPr>
-              <w:t>Nota 9.99 de 10</w:t>
+              <w:t>Nota 10.00 de 10</w:t>
             </w:r>
           </w:p>
         </w:tc>
@@ -8870,7 +8870,7 @@
                 <w:b w:val="0"/>
                 <w:sz w:val="18"/>
               </w:rPr>
-              <w:t>Hash e árvore de Merkle</w:t>
+              <w:t>test_custody.py</w:t>
             </w:r>
           </w:p>
         </w:tc>
@@ -8904,7 +8904,7 @@
                 <w:b w:val="0"/>
                 <w:sz w:val="18"/>
               </w:rPr>
-              <w:t>16</w:t>
+              <w:t>3</w:t>
             </w:r>
           </w:p>
         </w:tc>
@@ -8942,7 +8942,7 @@
                 <w:b w:val="0"/>
                 <w:sz w:val="18"/>
               </w:rPr>
-              <w:t>Nó: implantação, replay, persistência e laboratório</w:t>
+              <w:t>Hash e árvore de Merkle</w:t>
             </w:r>
           </w:p>
         </w:tc>
@@ -8975,7 +8975,7 @@
                 <w:b w:val="0"/>
                 <w:sz w:val="18"/>
               </w:rPr>
-              <w:t>40</w:t>
+              <w:t>16</w:t>
             </w:r>
           </w:p>
         </w:tc>
@@ -9014,7 +9014,7 @@
                 <w:b w:val="0"/>
                 <w:sz w:val="18"/>
               </w:rPr>
-              <w:t>API HTTP do nó</w:t>
+              <w:t>Nó: implantação, replay, persistência e laboratório</w:t>
             </w:r>
           </w:p>
         </w:tc>
@@ -9048,7 +9048,7 @@
                 <w:b w:val="0"/>
                 <w:sz w:val="18"/>
               </w:rPr>
-              <w:t>15</w:t>
+              <w:t>40</w:t>
             </w:r>
           </w:p>
         </w:tc>
@@ -9086,7 +9086,7 @@
                 <w:b w:val="0"/>
                 <w:sz w:val="18"/>
               </w:rPr>
-              <w:t>Transações assinadas</w:t>
+              <w:t>API HTTP do nó</w:t>
             </w:r>
           </w:p>
         </w:tc>
@@ -9119,7 +9119,7 @@
                 <w:b w:val="0"/>
                 <w:sz w:val="18"/>
               </w:rPr>
-              <w:t>25</w:t>
+              <w:t>15</w:t>
             </w:r>
           </w:p>
         </w:tc>
@@ -9158,7 +9158,7 @@
                 <w:b w:val="0"/>
                 <w:sz w:val="18"/>
               </w:rPr>
-              <w:t>Carteiras, assinaturas e keystore</w:t>
+              <w:t>Transações assinadas</w:t>
             </w:r>
           </w:p>
         </w:tc>
@@ -9192,7 +9192,7 @@
                 <w:b w:val="0"/>
                 <w:sz w:val="18"/>
               </w:rPr>
-              <w:t>11</w:t>
+              <w:t>25</w:t>
             </w:r>
           </w:p>
         </w:tc>
@@ -9230,7 +9230,7 @@
                 <w:b w:val="0"/>
                 <w:sz w:val="18"/>
               </w:rPr>
-              <w:t>Gateway web e carteiras</w:t>
+              <w:t>Carteiras, assinaturas e keystore</w:t>
             </w:r>
           </w:p>
         </w:tc>
@@ -9263,7 +9263,7 @@
                 <w:b w:val="0"/>
                 <w:sz w:val="18"/>
               </w:rPr>
-              <w:t>18</w:t>
+              <w:t>11</w:t>
             </w:r>
           </w:p>
         </w:tc>
@@ -9292,16 +9292,17 @@
           </w:tcPr>
           <w:p>
             <w:pPr>
+              <w:keepNext/>
               <w:spacing w:after="0" w:line="264" w:lineRule="auto"/>
               <w:jc w:val="left"/>
             </w:pPr>
             <w:r>
               <w:rPr>
                 <w:rFonts w:ascii="Arial" w:hAnsi="Arial" w:eastAsia="Arial" w:cs="Arial"/>
-                <w:b/>
+                <w:b w:val="0"/>
                 <w:sz w:val="18"/>
               </w:rPr>
-              <w:t>Total</w:t>
+              <w:t>Gateway web e carteiras</w:t>
             </w:r>
           </w:p>
         </w:tc>
@@ -9325,8 +9326,46 @@
           </w:tcPr>
           <w:p>
             <w:pPr>
+              <w:keepNext/>
               <w:spacing w:after="0" w:line="264" w:lineRule="auto"/>
               <w:jc w:val="center"/>
+            </w:pPr>
+            <w:r>
+              <w:rPr>
+                <w:rFonts w:ascii="Arial" w:hAnsi="Arial" w:eastAsia="Arial" w:cs="Arial"/>
+                <w:b w:val="0"/>
+                <w:sz w:val="18"/>
+              </w:rPr>
+              <w:t>18</w:t>
+            </w:r>
+          </w:p>
+        </w:tc>
+      </w:tr>
+      <w:tr>
+        <w:trPr>
+          <w:cantSplit w:val="true"/>
+        </w:trPr>
+        <w:tc>
+          <w:tcPr>
+            <w:tcW w:type="dxa" w:w="7087"/>
+            <w:tcBorders>
+              <w:top w:val="single" w:sz="4" w:color="B9CDB4"/>
+              <w:left w:val="single" w:sz="4" w:color="B9CDB4"/>
+              <w:bottom w:val="single" w:sz="4" w:color="B9CDB4"/>
+              <w:right w:val="single" w:sz="4" w:color="B9CDB4"/>
+            </w:tcBorders>
+            <w:tcMar>
+              <w:top w:w="60" w:type="dxa"/>
+              <w:left w:w="100" w:type="dxa"/>
+              <w:bottom w:w="60" w:type="dxa"/>
+              <w:right w:w="100" w:type="dxa"/>
+            </w:tcMar>
+            <w:vAlign w:val="center"/>
+          </w:tcPr>
+          <w:p>
+            <w:pPr>
+              <w:spacing w:after="0" w:line="264" w:lineRule="auto"/>
+              <w:jc w:val="left"/>
             </w:pPr>
             <w:r>
               <w:rPr>
@@ -9334,7 +9373,39 @@
                 <w:b/>
                 <w:sz w:val="18"/>
               </w:rPr>
-              <w:t>248</w:t>
+              <w:t>Total</w:t>
+            </w:r>
+          </w:p>
+        </w:tc>
+        <w:tc>
+          <w:tcPr>
+            <w:tcW w:type="dxa" w:w="1984"/>
+            <w:tcBorders>
+              <w:top w:val="single" w:sz="4" w:color="B9CDB4"/>
+              <w:left w:val="single" w:sz="4" w:color="B9CDB4"/>
+              <w:bottom w:val="single" w:sz="4" w:color="B9CDB4"/>
+              <w:right w:val="single" w:sz="4" w:color="B9CDB4"/>
+            </w:tcBorders>
+            <w:tcMar>
+              <w:top w:w="60" w:type="dxa"/>
+              <w:left w:w="100" w:type="dxa"/>
+              <w:bottom w:w="60" w:type="dxa"/>
+              <w:right w:w="100" w:type="dxa"/>
+            </w:tcMar>
+            <w:vAlign w:val="center"/>
+          </w:tcPr>
+          <w:p>
+            <w:pPr>
+              <w:spacing w:after="0" w:line="264" w:lineRule="auto"/>
+              <w:jc w:val="center"/>
+            </w:pPr>
+            <w:r>
+              <w:rPr>
+                <w:rFonts w:ascii="Arial" w:hAnsi="Arial" w:eastAsia="Arial" w:cs="Arial"/>
+                <w:b/>
+                <w:sz w:val="18"/>
+              </w:rPr>
+              <w:t>251</w:t>
             </w:r>
           </w:p>
         </w:tc>

</xml_diff>